<commit_message>
docs: broaden architecture comparison
</commit_message>
<xml_diff>
--- a/coursework/sudilovskiy_coursework_airflow_s3.docx
+++ b/coursework/sudilovskiy_coursework_airflow_s3.docx
@@ -995,7 +995,7 @@
           <w:rFonts w:ascii="Times New Roman" w:hAnsi="Times New Roman" w:eastAsia="Times New Roman"/>
           <w:sz w:val="24"/>
         </w:rPr>
-        <w:t>Таблица 1 – Сравнение архитектур аналитических хранилищ</w:t>
+        <w:t>Таблица 1 – Сравнение архитектур и технологий для задач multi-source ingestion</w:t>
       </w:r>
     </w:p>
     <w:tbl>
@@ -1005,17 +1005,14 @@
         <w:tblLook w:firstColumn="1" w:firstRow="1" w:lastColumn="0" w:lastRow="0" w:noHBand="0" w:noVBand="1" w:val="04A0"/>
       </w:tblPr>
       <w:tblGrid>
-        <w:gridCol w:w="1559"/>
-        <w:gridCol w:w="1559"/>
-        <w:gridCol w:w="1559"/>
-        <w:gridCol w:w="1559"/>
-        <w:gridCol w:w="1559"/>
-        <w:gridCol w:w="1559"/>
+        <w:gridCol w:w="3118"/>
+        <w:gridCol w:w="3118"/>
+        <w:gridCol w:w="3118"/>
       </w:tblGrid>
       <w:tr>
         <w:tc>
           <w:tcPr>
-            <w:tcW w:type="dxa" w:w="1559"/>
+            <w:tcW w:type="dxa" w:w="3118"/>
             <w:vAlign w:val="center"/>
             <w:shd w:fill="D9EAF7"/>
             <w:tcBorders>
@@ -1038,13 +1035,13 @@
                 <w:b/>
                 <w:sz w:val="22"/>
               </w:rPr>
-              <w:t>Архитектура</w:t>
+              <w:t>Подход</w:t>
             </w:r>
           </w:p>
         </w:tc>
         <w:tc>
           <w:tcPr>
-            <w:tcW w:type="dxa" w:w="1559"/>
+            <w:tcW w:type="dxa" w:w="3118"/>
             <w:vAlign w:val="center"/>
             <w:shd w:fill="D9EAF7"/>
             <w:tcBorders>
@@ -1067,13 +1064,13 @@
                 <w:b/>
                 <w:sz w:val="22"/>
               </w:rPr>
-              <w:t>ACID</w:t>
+              <w:t>Где уместен</w:t>
             </w:r>
           </w:p>
         </w:tc>
         <w:tc>
           <w:tcPr>
-            <w:tcW w:type="dxa" w:w="1559"/>
+            <w:tcW w:type="dxa" w:w="3118"/>
             <w:vAlign w:val="center"/>
             <w:shd w:fill="D9EAF7"/>
             <w:tcBorders>
@@ -1096,94 +1093,7 @@
                 <w:b/>
                 <w:sz w:val="22"/>
               </w:rPr>
-              <w:t>Стоимость хранения</w:t>
-            </w:r>
-          </w:p>
-        </w:tc>
-        <w:tc>
-          <w:tcPr>
-            <w:tcW w:type="dxa" w:w="1559"/>
-            <w:vAlign w:val="center"/>
-            <w:shd w:fill="D9EAF7"/>
-            <w:tcBorders>
-              <w:top w:val="single" w:sz="8" w:color="000000"/>
-              <w:left w:val="single" w:sz="8" w:color="000000"/>
-              <w:bottom w:val="single" w:sz="8" w:color="000000"/>
-              <w:right w:val="single" w:sz="8" w:color="000000"/>
-            </w:tcBorders>
-          </w:tcPr>
-          <w:p>
-            <w:pPr>
-              <w:spacing w:line="240" w:lineRule="auto" w:after="0"/>
-              <w:ind w:firstLine="0"/>
-              <w:jc w:val="center"/>
-            </w:pPr>
-            <w:r/>
-            <w:r>
-              <w:rPr>
-                <w:rFonts w:ascii="Times New Roman" w:hAnsi="Times New Roman" w:eastAsia="Times New Roman"/>
-                <w:b/>
-                <w:sz w:val="22"/>
-              </w:rPr>
-              <w:t>Типы данных</w:t>
-            </w:r>
-          </w:p>
-        </w:tc>
-        <w:tc>
-          <w:tcPr>
-            <w:tcW w:type="dxa" w:w="1559"/>
-            <w:vAlign w:val="center"/>
-            <w:shd w:fill="D9EAF7"/>
-            <w:tcBorders>
-              <w:top w:val="single" w:sz="8" w:color="000000"/>
-              <w:left w:val="single" w:sz="8" w:color="000000"/>
-              <w:bottom w:val="single" w:sz="8" w:color="000000"/>
-              <w:right w:val="single" w:sz="8" w:color="000000"/>
-            </w:tcBorders>
-          </w:tcPr>
-          <w:p>
-            <w:pPr>
-              <w:spacing w:line="240" w:lineRule="auto" w:after="0"/>
-              <w:ind w:firstLine="0"/>
-              <w:jc w:val="center"/>
-            </w:pPr>
-            <w:r/>
-            <w:r>
-              <w:rPr>
-                <w:rFonts w:ascii="Times New Roman" w:hAnsi="Times New Roman" w:eastAsia="Times New Roman"/>
-                <w:b/>
-                <w:sz w:val="22"/>
-              </w:rPr>
-              <w:t>Схема</w:t>
-            </w:r>
-          </w:p>
-        </w:tc>
-        <w:tc>
-          <w:tcPr>
-            <w:tcW w:type="dxa" w:w="1559"/>
-            <w:vAlign w:val="center"/>
-            <w:shd w:fill="D9EAF7"/>
-            <w:tcBorders>
-              <w:top w:val="single" w:sz="8" w:color="000000"/>
-              <w:left w:val="single" w:sz="8" w:color="000000"/>
-              <w:bottom w:val="single" w:sz="8" w:color="000000"/>
-              <w:right w:val="single" w:sz="8" w:color="000000"/>
-            </w:tcBorders>
-          </w:tcPr>
-          <w:p>
-            <w:pPr>
-              <w:spacing w:line="240" w:lineRule="auto" w:after="0"/>
-              <w:ind w:firstLine="0"/>
-              <w:jc w:val="center"/>
-            </w:pPr>
-            <w:r/>
-            <w:r>
-              <w:rPr>
-                <w:rFonts w:ascii="Times New Roman" w:hAnsi="Times New Roman" w:eastAsia="Times New Roman"/>
-                <w:b/>
-                <w:sz w:val="22"/>
-              </w:rPr>
-              <w:t>Оценка для проекта</w:t>
+              <w:t>Вывод для проекта</w:t>
             </w:r>
           </w:p>
         </w:tc>
@@ -1191,7 +1101,7 @@
       <w:tr>
         <w:tc>
           <w:tcPr>
-            <w:tcW w:type="dxa" w:w="1559"/>
+            <w:tcW w:type="dxa" w:w="3118"/>
             <w:vAlign w:val="center"/>
             <w:tcBorders>
               <w:top w:val="single" w:sz="8" w:color="000000"/>
@@ -1212,13 +1122,13 @@
                 <w:b w:val="0"/>
                 <w:sz w:val="20"/>
               </w:rPr>
-              <w:t>DWH</w:t>
+              <w:t>RDBMS / PostgreSQL-only</w:t>
             </w:r>
           </w:p>
         </w:tc>
         <w:tc>
           <w:tcPr>
-            <w:tcW w:type="dxa" w:w="1559"/>
+            <w:tcW w:type="dxa" w:w="3118"/>
             <w:vAlign w:val="center"/>
             <w:tcBorders>
               <w:top w:val="single" w:sz="8" w:color="000000"/>
@@ -1239,13 +1149,13 @@
                 <w:b w:val="0"/>
                 <w:sz w:val="20"/>
               </w:rPr>
-              <w:t>Высокие в рамках СУБД</w:t>
+              <w:t>Прикладные таблицы, транзакции, справочники, небольшие витрины</w:t>
             </w:r>
           </w:p>
         </w:tc>
         <w:tc>
           <w:tcPr>
-            <w:tcW w:type="dxa" w:w="1559"/>
+            <w:tcW w:type="dxa" w:w="3118"/>
             <w:vAlign w:val="center"/>
             <w:tcBorders>
               <w:top w:val="single" w:sz="8" w:color="000000"/>
@@ -1266,13 +1176,15 @@
                 <w:b w:val="0"/>
                 <w:sz w:val="20"/>
               </w:rPr>
-              <w:t>Выше для сырого архива</w:t>
+              <w:t>Не лучший primary raw-слой для множества API: нужна ранняя схема, сложнее хранить дешёвый файловый архив и подключать разные compute-движки</w:t>
             </w:r>
           </w:p>
         </w:tc>
+      </w:tr>
+      <w:tr>
         <w:tc>
           <w:tcPr>
-            <w:tcW w:type="dxa" w:w="1559"/>
+            <w:tcW w:type="dxa" w:w="3118"/>
             <w:vAlign w:val="center"/>
             <w:tcBorders>
               <w:top w:val="single" w:sz="8" w:color="000000"/>
@@ -1293,13 +1205,13 @@
                 <w:b w:val="0"/>
                 <w:sz w:val="20"/>
               </w:rPr>
-              <w:t>Структурированные</w:t>
+              <w:t>Классический DWH</w:t>
             </w:r>
           </w:p>
         </w:tc>
         <w:tc>
           <w:tcPr>
-            <w:tcW w:type="dxa" w:w="1559"/>
+            <w:tcW w:type="dxa" w:w="3118"/>
             <w:vAlign w:val="center"/>
             <w:tcBorders>
               <w:top w:val="single" w:sz="8" w:color="000000"/>
@@ -1320,13 +1232,13 @@
                 <w:b w:val="0"/>
                 <w:sz w:val="20"/>
               </w:rPr>
-              <w:t>Schema-on-write</w:t>
+              <w:t>Регламентированная отчётность и согласованная модель предприятия</w:t>
             </w:r>
           </w:p>
         </w:tc>
         <w:tc>
           <w:tcPr>
-            <w:tcW w:type="dxa" w:w="1559"/>
+            <w:tcW w:type="dxa" w:w="3118"/>
             <w:vAlign w:val="center"/>
             <w:tcBorders>
               <w:top w:val="single" w:sz="8" w:color="000000"/>
@@ -1347,7 +1259,7 @@
                 <w:b w:val="0"/>
                 <w:sz w:val="20"/>
               </w:rPr>
-              <w:t>Сильная модель, но слабая гибкость raw-слоя</w:t>
+              <w:t>Сильный serving/gold-слой, но raw-данные разной структуры лучше сначала приземлять в lake/lakehouse</w:t>
             </w:r>
           </w:p>
         </w:tc>
@@ -1355,7 +1267,7 @@
       <w:tr>
         <w:tc>
           <w:tcPr>
-            <w:tcW w:type="dxa" w:w="1559"/>
+            <w:tcW w:type="dxa" w:w="3118"/>
             <w:vAlign w:val="center"/>
             <w:tcBorders>
               <w:top w:val="single" w:sz="8" w:color="000000"/>
@@ -1382,7 +1294,7 @@
         </w:tc>
         <w:tc>
           <w:tcPr>
-            <w:tcW w:type="dxa" w:w="1559"/>
+            <w:tcW w:type="dxa" w:w="3118"/>
             <w:vAlign w:val="center"/>
             <w:tcBorders>
               <w:top w:val="single" w:sz="8" w:color="000000"/>
@@ -1403,13 +1315,13 @@
                 <w:b w:val="0"/>
                 <w:sz w:val="20"/>
               </w:rPr>
-              <w:t>Зависит от реализации</w:t>
+              <w:t>Дешёвое хранение любых файлов и schema-on-read</w:t>
             </w:r>
           </w:p>
         </w:tc>
         <w:tc>
           <w:tcPr>
-            <w:tcW w:type="dxa" w:w="1559"/>
+            <w:tcW w:type="dxa" w:w="3118"/>
             <w:vAlign w:val="center"/>
             <w:tcBorders>
               <w:top w:val="single" w:sz="8" w:color="000000"/>
@@ -1430,88 +1342,7 @@
                 <w:b w:val="0"/>
                 <w:sz w:val="20"/>
               </w:rPr>
-              <w:t>Низкая</w:t>
-            </w:r>
-          </w:p>
-        </w:tc>
-        <w:tc>
-          <w:tcPr>
-            <w:tcW w:type="dxa" w:w="1559"/>
-            <w:vAlign w:val="center"/>
-            <w:tcBorders>
-              <w:top w:val="single" w:sz="8" w:color="000000"/>
-              <w:left w:val="single" w:sz="8" w:color="000000"/>
-              <w:bottom w:val="single" w:sz="8" w:color="000000"/>
-              <w:right w:val="single" w:sz="8" w:color="000000"/>
-            </w:tcBorders>
-          </w:tcPr>
-          <w:p>
-            <w:pPr>
-              <w:spacing w:line="240" w:lineRule="auto" w:after="0"/>
-              <w:ind w:firstLine="0"/>
-            </w:pPr>
-            <w:r/>
-            <w:r>
-              <w:rPr>
-                <w:rFonts w:ascii="Times New Roman" w:hAnsi="Times New Roman" w:eastAsia="Times New Roman"/>
-                <w:b w:val="0"/>
-                <w:sz w:val="20"/>
-              </w:rPr>
-              <w:t>Любые файлы</w:t>
-            </w:r>
-          </w:p>
-        </w:tc>
-        <w:tc>
-          <w:tcPr>
-            <w:tcW w:type="dxa" w:w="1559"/>
-            <w:vAlign w:val="center"/>
-            <w:tcBorders>
-              <w:top w:val="single" w:sz="8" w:color="000000"/>
-              <w:left w:val="single" w:sz="8" w:color="000000"/>
-              <w:bottom w:val="single" w:sz="8" w:color="000000"/>
-              <w:right w:val="single" w:sz="8" w:color="000000"/>
-            </w:tcBorders>
-          </w:tcPr>
-          <w:p>
-            <w:pPr>
-              <w:spacing w:line="240" w:lineRule="auto" w:after="0"/>
-              <w:ind w:firstLine="0"/>
-            </w:pPr>
-            <w:r/>
-            <w:r>
-              <w:rPr>
-                <w:rFonts w:ascii="Times New Roman" w:hAnsi="Times New Roman" w:eastAsia="Times New Roman"/>
-                <w:b w:val="0"/>
-                <w:sz w:val="20"/>
-              </w:rPr>
-              <w:t>Schema-on-read</w:t>
-            </w:r>
-          </w:p>
-        </w:tc>
-        <w:tc>
-          <w:tcPr>
-            <w:tcW w:type="dxa" w:w="1559"/>
-            <w:vAlign w:val="center"/>
-            <w:tcBorders>
-              <w:top w:val="single" w:sz="8" w:color="000000"/>
-              <w:left w:val="single" w:sz="8" w:color="000000"/>
-              <w:bottom w:val="single" w:sz="8" w:color="000000"/>
-              <w:right w:val="single" w:sz="8" w:color="000000"/>
-            </w:tcBorders>
-          </w:tcPr>
-          <w:p>
-            <w:pPr>
-              <w:spacing w:line="240" w:lineRule="auto" w:after="0"/>
-              <w:ind w:firstLine="0"/>
-            </w:pPr>
-            <w:r/>
-            <w:r>
-              <w:rPr>
-                <w:rFonts w:ascii="Times New Roman" w:hAnsi="Times New Roman" w:eastAsia="Times New Roman"/>
-                <w:b w:val="0"/>
-                <w:sz w:val="20"/>
-              </w:rPr>
-              <w:t>Гибкий архив, но риск data swamp</w:t>
+              <w:t>Нужны правила слоёв, качество и метаданные, иначе появляется неуправляемое “болото данных”</w:t>
             </w:r>
           </w:p>
         </w:tc>
@@ -1519,171 +1350,7 @@
       <w:tr>
         <w:tc>
           <w:tcPr>
-            <w:tcW w:type="dxa" w:w="1559"/>
-            <w:vAlign w:val="center"/>
-            <w:tcBorders>
-              <w:top w:val="single" w:sz="8" w:color="000000"/>
-              <w:left w:val="single" w:sz="8" w:color="000000"/>
-              <w:bottom w:val="single" w:sz="8" w:color="000000"/>
-              <w:right w:val="single" w:sz="8" w:color="000000"/>
-            </w:tcBorders>
-          </w:tcPr>
-          <w:p>
-            <w:pPr>
-              <w:spacing w:line="240" w:lineRule="auto" w:after="0"/>
-              <w:ind w:firstLine="0"/>
-            </w:pPr>
-            <w:r/>
-            <w:r>
-              <w:rPr>
-                <w:rFonts w:ascii="Times New Roman" w:hAnsi="Times New Roman" w:eastAsia="Times New Roman"/>
-                <w:b w:val="0"/>
-                <w:sz w:val="20"/>
-              </w:rPr>
-              <w:t>Lambda/Kappa</w:t>
-            </w:r>
-          </w:p>
-        </w:tc>
-        <w:tc>
-          <w:tcPr>
-            <w:tcW w:type="dxa" w:w="1559"/>
-            <w:vAlign w:val="center"/>
-            <w:tcBorders>
-              <w:top w:val="single" w:sz="8" w:color="000000"/>
-              <w:left w:val="single" w:sz="8" w:color="000000"/>
-              <w:bottom w:val="single" w:sz="8" w:color="000000"/>
-              <w:right w:val="single" w:sz="8" w:color="000000"/>
-            </w:tcBorders>
-          </w:tcPr>
-          <w:p>
-            <w:pPr>
-              <w:spacing w:line="240" w:lineRule="auto" w:after="0"/>
-              <w:ind w:firstLine="0"/>
-            </w:pPr>
-            <w:r/>
-            <w:r>
-              <w:rPr>
-                <w:rFonts w:ascii="Times New Roman" w:hAnsi="Times New Roman" w:eastAsia="Times New Roman"/>
-                <w:b w:val="0"/>
-                <w:sz w:val="20"/>
-              </w:rPr>
-              <w:t>Зависит от стеков</w:t>
-            </w:r>
-          </w:p>
-        </w:tc>
-        <w:tc>
-          <w:tcPr>
-            <w:tcW w:type="dxa" w:w="1559"/>
-            <w:vAlign w:val="center"/>
-            <w:tcBorders>
-              <w:top w:val="single" w:sz="8" w:color="000000"/>
-              <w:left w:val="single" w:sz="8" w:color="000000"/>
-              <w:bottom w:val="single" w:sz="8" w:color="000000"/>
-              <w:right w:val="single" w:sz="8" w:color="000000"/>
-            </w:tcBorders>
-          </w:tcPr>
-          <w:p>
-            <w:pPr>
-              <w:spacing w:line="240" w:lineRule="auto" w:after="0"/>
-              <w:ind w:firstLine="0"/>
-            </w:pPr>
-            <w:r/>
-            <w:r>
-              <w:rPr>
-                <w:rFonts w:ascii="Times New Roman" w:hAnsi="Times New Roman" w:eastAsia="Times New Roman"/>
-                <w:b w:val="0"/>
-                <w:sz w:val="20"/>
-              </w:rPr>
-              <w:t>Средняя/высокая</w:t>
-            </w:r>
-          </w:p>
-        </w:tc>
-        <w:tc>
-          <w:tcPr>
-            <w:tcW w:type="dxa" w:w="1559"/>
-            <w:vAlign w:val="center"/>
-            <w:tcBorders>
-              <w:top w:val="single" w:sz="8" w:color="000000"/>
-              <w:left w:val="single" w:sz="8" w:color="000000"/>
-              <w:bottom w:val="single" w:sz="8" w:color="000000"/>
-              <w:right w:val="single" w:sz="8" w:color="000000"/>
-            </w:tcBorders>
-          </w:tcPr>
-          <w:p>
-            <w:pPr>
-              <w:spacing w:line="240" w:lineRule="auto" w:after="0"/>
-              <w:ind w:firstLine="0"/>
-            </w:pPr>
-            <w:r/>
-            <w:r>
-              <w:rPr>
-                <w:rFonts w:ascii="Times New Roman" w:hAnsi="Times New Roman" w:eastAsia="Times New Roman"/>
-                <w:b w:val="0"/>
-                <w:sz w:val="20"/>
-              </w:rPr>
-              <w:t>Batch/stream</w:t>
-            </w:r>
-          </w:p>
-        </w:tc>
-        <w:tc>
-          <w:tcPr>
-            <w:tcW w:type="dxa" w:w="1559"/>
-            <w:vAlign w:val="center"/>
-            <w:tcBorders>
-              <w:top w:val="single" w:sz="8" w:color="000000"/>
-              <w:left w:val="single" w:sz="8" w:color="000000"/>
-              <w:bottom w:val="single" w:sz="8" w:color="000000"/>
-              <w:right w:val="single" w:sz="8" w:color="000000"/>
-            </w:tcBorders>
-          </w:tcPr>
-          <w:p>
-            <w:pPr>
-              <w:spacing w:line="240" w:lineRule="auto" w:after="0"/>
-              <w:ind w:firstLine="0"/>
-            </w:pPr>
-            <w:r/>
-            <w:r>
-              <w:rPr>
-                <w:rFonts w:ascii="Times New Roman" w:hAnsi="Times New Roman" w:eastAsia="Times New Roman"/>
-                <w:b w:val="0"/>
-                <w:sz w:val="20"/>
-              </w:rPr>
-              <w:t>Разная</w:t>
-            </w:r>
-          </w:p>
-        </w:tc>
-        <w:tc>
-          <w:tcPr>
-            <w:tcW w:type="dxa" w:w="1559"/>
-            <w:vAlign w:val="center"/>
-            <w:tcBorders>
-              <w:top w:val="single" w:sz="8" w:color="000000"/>
-              <w:left w:val="single" w:sz="8" w:color="000000"/>
-              <w:bottom w:val="single" w:sz="8" w:color="000000"/>
-              <w:right w:val="single" w:sz="8" w:color="000000"/>
-            </w:tcBorders>
-          </w:tcPr>
-          <w:p>
-            <w:pPr>
-              <w:spacing w:line="240" w:lineRule="auto" w:after="0"/>
-              <w:ind w:firstLine="0"/>
-            </w:pPr>
-            <w:r/>
-            <w:r>
-              <w:rPr>
-                <w:rFonts w:ascii="Times New Roman" w:hAnsi="Times New Roman" w:eastAsia="Times New Roman"/>
-                <w:b w:val="0"/>
-                <w:sz w:val="20"/>
-              </w:rPr>
-              <w:t>Хорошо для real-time, сложнее для учебного стенда</w:t>
-            </w:r>
-          </w:p>
-        </w:tc>
-      </w:tr>
-      <w:tr>
-        <w:tc>
-          <w:tcPr>
-            <w:tcW w:type="dxa" w:w="1559"/>
+            <w:tcW w:type="dxa" w:w="3118"/>
             <w:vAlign w:val="center"/>
             <w:tcBorders>
               <w:top w:val="single" w:sz="8" w:color="000000"/>
@@ -1710,7 +1377,7 @@
         </w:tc>
         <w:tc>
           <w:tcPr>
-            <w:tcW w:type="dxa" w:w="1559"/>
+            <w:tcW w:type="dxa" w:w="3118"/>
             <w:vAlign w:val="center"/>
             <w:tcBorders>
               <w:top w:val="single" w:sz="8" w:color="000000"/>
@@ -1731,13 +1398,13 @@
                 <w:b w:val="0"/>
                 <w:sz w:val="20"/>
               </w:rPr>
-              <w:t>Возможны через table formats</w:t>
+              <w:t>Multi-source ingest, хранение raw + развитие до BI/ML</w:t>
             </w:r>
           </w:p>
         </w:tc>
         <w:tc>
           <w:tcPr>
-            <w:tcW w:type="dxa" w:w="1559"/>
+            <w:tcW w:type="dxa" w:w="3118"/>
             <w:vAlign w:val="center"/>
             <w:tcBorders>
               <w:top w:val="single" w:sz="8" w:color="000000"/>
@@ -1758,13 +1425,15 @@
                 <w:b w:val="0"/>
                 <w:sz w:val="20"/>
               </w:rPr>
-              <w:t>Низкая для хранения</w:t>
+              <w:t>Лучший базовый вариант для проекта: bronze/silver/gold, открытые форматы, разделение storage/compute</w:t>
             </w:r>
           </w:p>
         </w:tc>
+      </w:tr>
+      <w:tr>
         <w:tc>
           <w:tcPr>
-            <w:tcW w:type="dxa" w:w="1559"/>
+            <w:tcW w:type="dxa" w:w="3118"/>
             <w:vAlign w:val="center"/>
             <w:tcBorders>
               <w:top w:val="single" w:sz="8" w:color="000000"/>
@@ -1785,13 +1454,13 @@
                 <w:b w:val="0"/>
                 <w:sz w:val="20"/>
               </w:rPr>
-              <w:t>Структурированные и полу-структурированные</w:t>
+              <w:t>Kafka/Flink streaming</w:t>
             </w:r>
           </w:p>
         </w:tc>
         <w:tc>
           <w:tcPr>
-            <w:tcW w:type="dxa" w:w="1559"/>
+            <w:tcW w:type="dxa" w:w="3118"/>
             <w:vAlign w:val="center"/>
             <w:tcBorders>
               <w:top w:val="single" w:sz="8" w:color="000000"/>
@@ -1812,13 +1481,13 @@
                 <w:b w:val="0"/>
                 <w:sz w:val="20"/>
               </w:rPr>
-              <w:t>Schema-on-read + управляемые таблицы</w:t>
+              <w:t>События в реальном времени и минимальная задержка</w:t>
             </w:r>
           </w:p>
         </w:tc>
         <w:tc>
           <w:tcPr>
-            <w:tcW w:type="dxa" w:w="1559"/>
+            <w:tcW w:type="dxa" w:w="3118"/>
             <w:vAlign w:val="center"/>
             <w:tcBorders>
               <w:top w:val="single" w:sz="8" w:color="000000"/>
@@ -1839,7 +1508,7 @@
                 <w:b w:val="0"/>
                 <w:sz w:val="20"/>
               </w:rPr>
-              <w:t>Баланс raw-хранения и аналитики</w:t>
+              <w:t>Для периодического API-ingest избыточно как основа; может добавиться позже для streaming-источников</w:t>
             </w:r>
           </w:p>
         </w:tc>
@@ -1847,7 +1516,7 @@
       <w:tr>
         <w:tc>
           <w:tcPr>
-            <w:tcW w:type="dxa" w:w="1559"/>
+            <w:tcW w:type="dxa" w:w="3118"/>
             <w:vAlign w:val="center"/>
             <w:tcBorders>
               <w:top w:val="single" w:sz="8" w:color="000000"/>
@@ -1868,13 +1537,13 @@
                 <w:b w:val="0"/>
                 <w:sz w:val="20"/>
               </w:rPr>
-              <w:t>Data Mesh</w:t>
+              <w:t>ClickHouse serving</w:t>
             </w:r>
           </w:p>
         </w:tc>
         <w:tc>
           <w:tcPr>
-            <w:tcW w:type="dxa" w:w="1559"/>
+            <w:tcW w:type="dxa" w:w="3118"/>
             <w:vAlign w:val="center"/>
             <w:tcBorders>
               <w:top w:val="single" w:sz="8" w:color="000000"/>
@@ -1895,13 +1564,13 @@
                 <w:b w:val="0"/>
                 <w:sz w:val="20"/>
               </w:rPr>
-              <w:t>Зависит от доменов</w:t>
+              <w:t>Быстрые OLAP-запросы и дашборды по подготовленным данным</w:t>
             </w:r>
           </w:p>
         </w:tc>
         <w:tc>
           <w:tcPr>
-            <w:tcW w:type="dxa" w:w="1559"/>
+            <w:tcW w:type="dxa" w:w="3118"/>
             <w:vAlign w:val="center"/>
             <w:tcBorders>
               <w:top w:val="single" w:sz="8" w:color="000000"/>
@@ -1922,13 +1591,15 @@
                 <w:b w:val="0"/>
                 <w:sz w:val="20"/>
               </w:rPr>
-              <w:t>Организационно высокая</w:t>
+              <w:t>Хорош для gold/serving-слоя, но не заменяет raw-архив и повторную обработку</w:t>
             </w:r>
           </w:p>
         </w:tc>
+      </w:tr>
+      <w:tr>
         <w:tc>
           <w:tcPr>
-            <w:tcW w:type="dxa" w:w="1559"/>
+            <w:tcW w:type="dxa" w:w="3118"/>
             <w:vAlign w:val="center"/>
             <w:tcBorders>
               <w:top w:val="single" w:sz="8" w:color="000000"/>
@@ -1949,13 +1620,13 @@
                 <w:b w:val="0"/>
                 <w:sz w:val="20"/>
               </w:rPr>
-              <w:t>Разные домены</w:t>
+              <w:t>NoSQL document/key-value</w:t>
             </w:r>
           </w:p>
         </w:tc>
         <w:tc>
           <w:tcPr>
-            <w:tcW w:type="dxa" w:w="1559"/>
+            <w:tcW w:type="dxa" w:w="3118"/>
             <w:vAlign w:val="center"/>
             <w:tcBorders>
               <w:top w:val="single" w:sz="8" w:color="000000"/>
@@ -1976,13 +1647,13 @@
                 <w:b w:val="0"/>
                 <w:sz w:val="20"/>
               </w:rPr>
-              <w:t>Data products</w:t>
+              <w:t>Гибкое хранение документов или быстрые lookup-сценарии</w:t>
             </w:r>
           </w:p>
         </w:tc>
         <w:tc>
           <w:tcPr>
-            <w:tcW w:type="dxa" w:w="1559"/>
+            <w:tcW w:type="dxa" w:w="3118"/>
             <w:vAlign w:val="center"/>
             <w:tcBorders>
               <w:top w:val="single" w:sz="8" w:color="000000"/>
@@ -2003,7 +1674,7 @@
                 <w:b w:val="0"/>
                 <w:sz w:val="20"/>
               </w:rPr>
-              <w:t>Подходит крупным организациям</w:t>
+              <w:t>Не является универсальной аналитической архитектурой для Parquet/S3 и SQL-обработки</w:t>
             </w:r>
           </w:p>
         </w:tc>
@@ -2034,7 +1705,7 @@
           <w:i w:val="0"/>
           <w:sz w:val="28"/>
         </w:rPr>
-        <w:t>Для разрабатываемой системы выбран подход Data Lakehouse, потому что задача изначально ориентирована на Big Data сценарий: количество источников может расти, структура ответов API может отличаться, а данные в будущем могут использоваться как для BI, так и для ML. Если сразу загружать исходные данные только в PostgreSQL, система будет жёстко зависеть от заранее выбранной табличной схемы и станет хуже поддерживать schema evolution, повторную обработку и хранение исходных снимков.</w:t>
+        <w:t>Для разрабатываемой системы выбран подход Data Lakehouse, потому что задача относится к классу multi-source API ingestion: данные приходят из внешних систем, имеют полу-структурированный формат, могут поступать с разной периодичностью и должны сохраняться так, чтобы их можно было повторно обработать при изменении бизнес-логики. Для такого класса задач базовой архитектурой целесообразно делать не одну прикладную базу данных, а отдельный raw/bronze-слой на объектном хранилище с открытыми форматами.</w:t>
       </w:r>
     </w:p>
     <w:p>
@@ -2050,7 +1721,7 @@
           <w:i w:val="0"/>
           <w:sz w:val="28"/>
         </w:rPr>
-        <w:t>PostgreSQL является сильной СУБД для транзакционных данных, справочников, метаданных и serving-слоя небольших или средних витрин. Однако он не является оптимальным первичным хранилищем для сырого массива данных из множества внешних API. В raw-слое важно сохранять данные в исходной или близкой к исходной форме, хранить большое число файлов, дешево масштабировать объём и не выполнять дорогостоящую миграцию таблиц при каждом изменении структуры источника. Эти требования лучше закрывает объектное хранилище с открытыми файловыми форматами.</w:t>
+        <w:t>Классический DWH хорошо подходит для стабильной отчётности, когда данные уже очищены и модель предметной области согласована. Потоковая архитектура Kafka/Flink уместна, когда нужны события в реальном времени и задержки в секунды. ClickHouse эффективен как высокопроизводительный аналитический serving-слой. NoSQL-хранилища подходят для быстрых key-value или document-сценариев. Локальная файловая система применима только для простых автономных запусков. В рассматриваемой задаче требуется прежде всего надёжный ingest, хранение исходных снимков, расширение на новые источники и последующая аналитика, поэтому Lakehouse является более сбалансированным вариантом.</w:t>
       </w:r>
     </w:p>
     <w:p>
@@ -2082,19 +1753,7 @@
           <w:i w:val="0"/>
           <w:sz w:val="28"/>
         </w:rPr>
-        <w:t>Ограничения проекта также влияют на выбор. Требуется open source стек, локальное развёртывание и возможность показать архитектуру без облачной инфраструктуры. Поэтому вместо управляемого AWS S3 используется MinIO, вместо тяжёлого Spark-кластера на первом этапе — DuckDB, а вместо промышленного секретного хранилища — Airflow Variables с описанием дальнейшего перехода к Connections и Secrets API.</w:t>
-      </w:r>
-    </w:p>
-    <w:p>
-      <w:pPr>
-        <w:pStyle w:val="Heading2"/>
-      </w:pPr>
-      <w:r>
-        <w:rPr>
-          <w:rFonts w:ascii="Times New Roman" w:hAnsi="Times New Roman" w:eastAsia="Times New Roman"/>
-          <w:color w:val="000000"/>
-        </w:rPr>
-        <w:t>1.3. Medallion-архитектура bronze / silver / gold</w:t>
+        <w:t>Реляционные СУБД, включая PostgreSQL, в такой архитектуре не исключаются, но занимают другое место: они могут хранить метаданные, справочники, результаты агрегирования или обслуживать витрины. Однако raw-архив большого количества внешних источников рациональнее хранить в объектном хранилище, потому что оно дешевле масштабируется по объёму, не требует немедленной фиксации схемы и остаётся доступным для разных вычислительных движков: DuckDB, Spark, Trino, ClickHouse или BI-инструментов.</w:t>
       </w:r>
     </w:p>
     <w:p>
@@ -2110,7 +1769,19 @@
           <w:i w:val="0"/>
           <w:sz w:val="28"/>
         </w:rPr>
-        <w:t>Medallion-архитектура делит данные на несколько уровней зрелости. Bronze-слой хранит исходные снимки из источников. Silver-слой содержит очищенные, типизированные и нормализованные данные. Gold-слой содержит витрины, агрегаты и наборы данных, готовые для BI, аналитики и ML. Такое разделение снижает связность между ingest и аналитическими сценариями.</w:t>
+        <w:t>Ограничения проекта также влияют на выбор. Требуется open source стек, локальное развёртывание и возможность показать архитектуру без облачной инфраструктуры. Поэтому вместо управляемого AWS S3 используется MinIO, вместо распределённого Spark-кластера на первом этапе — DuckDB, а вместо промышленного secret backend — Airflow Variables с описанием дальнейшего перехода к Connections и Secrets API.</w:t>
+      </w:r>
+    </w:p>
+    <w:p>
+      <w:pPr>
+        <w:pStyle w:val="Heading2"/>
+      </w:pPr>
+      <w:r>
+        <w:rPr>
+          <w:rFonts w:ascii="Times New Roman" w:hAnsi="Times New Roman" w:eastAsia="Times New Roman"/>
+          <w:color w:val="000000"/>
+        </w:rPr>
+        <w:t>1.3. Medallion-архитектура bronze / silver / gold</w:t>
       </w:r>
     </w:p>
     <w:p>
@@ -2126,7 +1797,7 @@
           <w:i w:val="0"/>
           <w:sz w:val="28"/>
         </w:rPr>
-        <w:t>В данной курсовой реализуется именно bronze-слой. Это не означает, что проект ограничивается учебной загрузкой файла. Напротив, bronze-слой является обязательной основой масштабируемого Lakehouse: если завтра появятся новые источники или изменятся правила расчётов, исходные данные можно перечитать и заново построить производные слои. Без bronze-слоя система теряет возможность воспроизводимого backfill и аудита исходных данных.</w:t>
+        <w:t>Medallion-архитектура делит данные на несколько уровней зрелости. Bronze-слой хранит исходные снимки из источников. Silver-слой содержит очищенные, типизированные и нормализованные данные. Gold-слой содержит витрины, агрегаты и наборы данных, готовые для BI, аналитики и ML. Такое разделение снижает связность между ingest и аналитическими сценариями.</w:t>
       </w:r>
     </w:p>
     <w:p>
@@ -2142,6 +1813,22 @@
           <w:i w:val="0"/>
           <w:sz w:val="28"/>
         </w:rPr>
+        <w:t>В данной курсовой реализуется именно bronze-слой. Это не означает, что проект ограничивается учебной загрузкой файла. Напротив, bronze-слой является обязательной основой масштабируемого Lakehouse: если завтра появятся новые источники или изменятся правила расчётов, исходные данные можно перечитать и заново построить производные слои. Без bronze-слоя система теряет возможность воспроизводимого backfill и аудита исходных данных.</w:t>
+      </w:r>
+    </w:p>
+    <w:p>
+      <w:pPr>
+        <w:spacing w:line="360" w:lineRule="auto" w:after="0"/>
+        <w:ind w:firstLine="709"/>
+        <w:jc w:val="both"/>
+      </w:pPr>
+      <w:r>
+        <w:rPr>
+          <w:rFonts w:ascii="Times New Roman" w:hAnsi="Times New Roman" w:eastAsia="Times New Roman"/>
+          <w:b w:val="0"/>
+          <w:i w:val="0"/>
+          <w:sz w:val="28"/>
+        </w:rPr>
         <w:t>Silver- и gold-слои рассматриваются как направления развития. В silver-слое state vector OpenSky должен быть разобран на именованные поля: icao24, callsign, origin_country, time_position, last_contact, longitude, latitude, velocity и другие. В gold-слое могут появиться витрины по странам, временным интервалам, высоте, скорости или зонам наблюдения.</w:t>
       </w:r>
     </w:p>
@@ -2152,7 +1839,7 @@
       <w:r>
         <w:drawing>
           <wp:inline xmlns:a="http://schemas.openxmlformats.org/drawingml/2006/main" xmlns:pic="http://schemas.openxmlformats.org/drawingml/2006/picture">
-            <wp:extent cx="5580000" cy="2682374"/>
+            <wp:extent cx="5580000" cy="2787133"/>
             <wp:docPr id="1" name="Picture 1"/>
             <wp:cNvGraphicFramePr>
               <a:graphicFrameLocks noChangeAspect="1"/>
@@ -2173,7 +1860,7 @@
                   <pic:spPr>
                     <a:xfrm>
                       <a:off x="0" y="0"/>
-                      <a:ext cx="5580000" cy="2682374"/>
+                      <a:ext cx="5580000" cy="2787133"/>
                     </a:xfrm>
                     <a:prstGeom prst="rect"/>
                   </pic:spPr>
@@ -2256,6 +1943,22 @@
           <w:sz w:val="28"/>
         </w:rPr>
         <w:t>Системы оркестрации — Airflow, Prefect и Dagster — отвечают за расписание, зависимости и наблюдаемость. Движки обработки — Spark, Trino, DuckDB, ClickHouse — решают разные задачи. Spark нужен для распределённой обработки больших объёмов, Trino — для федеративных SQL-запросов, ClickHouse — для высокопроизводительной аналитической выдачи, DuckDB — для локальной SQL-обработки файлов и API-снимков на первом этапе.</w:t>
+      </w:r>
+    </w:p>
+    <w:p>
+      <w:pPr>
+        <w:spacing w:line="360" w:lineRule="auto" w:after="0"/>
+        <w:ind w:firstLine="709"/>
+        <w:jc w:val="both"/>
+      </w:pPr>
+      <w:r>
+        <w:rPr>
+          <w:rFonts w:ascii="Times New Roman" w:hAnsi="Times New Roman" w:eastAsia="Times New Roman"/>
+          <w:b w:val="0"/>
+          <w:i w:val="0"/>
+          <w:sz w:val="28"/>
+        </w:rPr>
+        <w:t>При выборе стека важно не подменять архитектурное решение отдельным инструментом. Для хранения raw-данных лучше использовать объектное хранилище и файлы Parquet/ORC, для регулярного запуска — оркестратор, для тяжёлых преобразований — распределённый движок, для быстрой выдачи агрегатов — аналитическую СУБД или DWH-витрину. В курсовом проекте реализуется первый этап этой цепочки: автоматический ingest и сохранение bronze-слоя.</w:t>
       </w:r>
     </w:p>
     <w:p>
@@ -2507,7 +2210,7 @@
                 <w:b w:val="0"/>
                 <w:sz w:val="20"/>
               </w:rPr>
-              <w:t>Нужны DAG, retry, backfill, UI, история запусков и стандартная модель batch data pipeline.</w:t>
+              <w:t>Для регулярного API-ingest лучше workflow-оркестратор с retry, backfill, логами и состоянием задач; cron подходит только для простых одиночных запусков.</w:t>
             </w:r>
           </w:p>
         </w:tc>
@@ -2590,7 +2293,7 @@
                 <w:b w:val="0"/>
                 <w:sz w:val="20"/>
               </w:rPr>
-              <w:t>PostgreSQL, локальная FS, Ceph, AWS S3</w:t>
+              <w:t>Локальная FS, HDFS, Ceph, AWS S3, RDBMS</w:t>
             </w:r>
           </w:p>
         </w:tc>
@@ -2617,7 +2320,7 @@
                 <w:b w:val="0"/>
                 <w:sz w:val="20"/>
               </w:rPr>
-              <w:t>Нужно отделить хранение от вычислений и сохранить полу-структурированный архив в открытых файлах.</w:t>
+              <w:t>Для такого класса задач лучше объектное хранилище: оно масштабируется по объёму и не привязывает raw-данные к конкретной СУБД.</w:t>
             </w:r>
           </w:p>
         </w:tc>
@@ -2646,7 +2349,7 @@
                 <w:b w:val="0"/>
                 <w:sz w:val="20"/>
               </w:rPr>
-              <w:t>Обработка</w:t>
+              <w:t>Обработка bronze</w:t>
             </w:r>
           </w:p>
         </w:tc>
@@ -2727,7 +2430,7 @@
                 <w:b w:val="0"/>
                 <w:sz w:val="20"/>
               </w:rPr>
-              <w:t>Для первого bronze-ingest достаточно встроенного SQL-движка; архитектура сохраняет путь к Spark при росте объёмов.</w:t>
+              <w:t>На первом этапе лучше лёгкий SQL-движок без кластера; Spark/Trino уместны при росте объёмов и числа хранилищ.</w:t>
             </w:r>
           </w:p>
         </w:tc>
@@ -2756,7 +2459,7 @@
                 <w:b w:val="0"/>
                 <w:sz w:val="20"/>
               </w:rPr>
-              <w:t>Формат</w:t>
+              <w:t>Аналитический формат</w:t>
             </w:r>
           </w:p>
         </w:tc>
@@ -2783,7 +2486,7 @@
                 <w:b w:val="0"/>
                 <w:sz w:val="20"/>
               </w:rPr>
-              <w:t>Parquet</w:t>
+              <w:t>Parquet + ZSTD</w:t>
             </w:r>
           </w:p>
         </w:tc>
@@ -2810,7 +2513,7 @@
                 <w:b w:val="0"/>
                 <w:sz w:val="20"/>
               </w:rPr>
-              <w:t>CSV, JSON, ORC</w:t>
+              <w:t>JSON, CSV, ORC, Avro</w:t>
             </w:r>
           </w:p>
         </w:tc>
@@ -2837,7 +2540,7 @@
                 <w:b w:val="0"/>
                 <w:sz w:val="20"/>
               </w:rPr>
-              <w:t>Колоночный формат снижает стоимость последующего чтения и поддерживается большинством аналитических движков.</w:t>
+              <w:t>Для последующей аналитики лучше колоночный формат; JSON/CSV полезны для обмена, но хуже для массового чтения.</w:t>
             </w:r>
           </w:p>
         </w:tc>
@@ -2866,7 +2569,7 @@
                 <w:b w:val="0"/>
                 <w:sz w:val="20"/>
               </w:rPr>
-              <w:t>Метаданные Airflow</w:t>
+              <w:t>Table format на будущее</w:t>
             </w:r>
           </w:p>
         </w:tc>
@@ -2893,7 +2596,7 @@
                 <w:b w:val="0"/>
                 <w:sz w:val="20"/>
               </w:rPr>
-              <w:t>PostgreSQL</w:t>
+              <w:t>Iceberg / Delta / Hudi</w:t>
             </w:r>
           </w:p>
         </w:tc>
@@ -2920,7 +2623,7 @@
                 <w:b w:val="0"/>
                 <w:sz w:val="20"/>
               </w:rPr>
-              <w:t>SQLite, MySQL</w:t>
+              <w:t>Обычные Parquet-файлы</w:t>
             </w:r>
           </w:p>
         </w:tc>
@@ -2947,7 +2650,7 @@
                 <w:b w:val="0"/>
                 <w:sz w:val="20"/>
               </w:rPr>
-              <w:t>CeleryExecutor требует надёжной внешней БД метаданных; SQLite не подходит для распределённой схемы.</w:t>
+              <w:t>Нужны при schema evolution, ACID, upsert и time travel; для начального bronze-слоя достаточно Parquet.</w:t>
             </w:r>
           </w:p>
         </w:tc>
@@ -2976,7 +2679,7 @@
                 <w:b w:val="0"/>
                 <w:sz w:val="20"/>
               </w:rPr>
-              <w:t>Очередь задач</w:t>
+              <w:t>Serving-слой на будущее</w:t>
             </w:r>
           </w:p>
         </w:tc>
@@ -3003,7 +2706,7 @@
                 <w:b w:val="0"/>
                 <w:sz w:val="20"/>
               </w:rPr>
-              <w:t>Redis</w:t>
+              <w:t>ClickHouse / DWH / BI</w:t>
             </w:r>
           </w:p>
         </w:tc>
@@ -3030,7 +2733,7 @@
                 <w:b w:val="0"/>
                 <w:sz w:val="20"/>
               </w:rPr>
-              <w:t>RabbitMQ, LocalExecutor</w:t>
+              <w:t>Прямое чтение raw</w:t>
             </w:r>
           </w:p>
         </w:tc>
@@ -3057,7 +2760,7 @@
                 <w:b w:val="0"/>
                 <w:sz w:val="20"/>
               </w:rPr>
-              <w:t>Redis обеспечивает broker для CeleryExecutor и демонстрирует распределённое выполнение задач.</w:t>
+              <w:t>Агрегированные данные лучше отдавать из подготовленных витрин, а не из сырого API-архива.</w:t>
             </w:r>
           </w:p>
         </w:tc>
@@ -5035,7 +4738,7 @@
           <w:i w:val="0"/>
           <w:sz w:val="28"/>
         </w:rPr>
-        <w:t>MinIO выбран как локальная реализация S3-совместимого объектного хранилища. Инженерная причина выбора — совместимость с S3 API и возможность отработать архитектурный паттерн, который переносится на облачное хранилище. Альтернативная загрузка raw-данных в PostgreSQL хуже соответствует требованиям: PostgreSQL требует заранее спроектированных таблиц, дороже хранит сырой полу-структурированный архив и связывает вычисления с конкретной СУБД. MinIO же позволяет хранить файлы открытого формата и подключать разные движки обработки.</w:t>
+        <w:t>Для задач автоматического сбора данных из внешних API оптимальная базовая схема выглядит как «оркестратор + объектное хранилище + открытый аналитический формат + вычислительный движок». Оркестратор отвечает за расписание и отказоустойчивость, объектное хранилище — за масштабируемое хранение raw-снимков, файловый формат — за эффективное последующее чтение, а вычислительный движок — за преобразование данных. Остальные технологии могут подключаться как специализированные слои, но не заменяют всю схему целиком.</w:t>
       </w:r>
     </w:p>
     <w:p>
@@ -5051,7 +4754,7 @@
           <w:i w:val="0"/>
           <w:sz w:val="28"/>
         </w:rPr>
-        <w:t>Apache Airflow выбран как оркестратор, потому что задача требует управляемых запусков, retries, backfill, ограничений параллельности и истории выполнения. Cron может запускать команду по расписанию, но не хранит граф зависимостей и не даёт полноценного состояния задач. Prefect и Dagster являются современными альтернативами, но Airflow остаётся распространённым стандартом для batch data pipelines и хорошо демонстрирует промышленную модель DAG, scheduler, worker и metadata database.</w:t>
+        <w:t>MinIO выбран как локальная реализация S3-совместимого объектного хранилища. Для такого рода задач лучше использовать S3-совместимый storage, потому что он отделяет хранение от вычислений и позволяет подключать разные движки к одним и тем же файлам. Локальная файловая система проще, но хуже переносится в распределённую среду. HDFS требует отдельной Hadoop-инфраструктуры. Ceph подходит для более крупного self-hosted кластера. Облачный AWS S3 является промышленным аналогом, но для курсового стенда MinIO воспроизводит тот же API локально.</w:t>
       </w:r>
     </w:p>
     <w:p>
@@ -5067,7 +4770,7 @@
           <w:i w:val="0"/>
           <w:sz w:val="28"/>
         </w:rPr>
-        <w:t>DuckDB выбран как движок ELT для первого этапа, потому что он поддерживает чтение JSON, запись Parquet и работу с S3 через httpfs без отдельного кластера. Spark был бы оправдан при больших объёмах и распределённой обработке, но для bronze-ingest одного API-снимка он увеличил бы инфраструктурную сложность. При этом архитектура не закрывает путь к Spark: данные уже лежат в Parquet/S3 и могут быть обработаны распределённо на следующем этапе.</w:t>
+        <w:t>Apache Airflow выбран как оркестратор. Для регулярного batch-ingest из API лучше использовать систему workflow orchestration, а не cron или ручной запуск скрипта: нужны зависимости, retry, backfill, история запусков, логи и UI. Prefect и Dagster также подходят для современных data pipelines, но Airflow выбран как распространённый стандарт в batch ETL/ELT и как инструмент, хорошо показывающий архитектуру scheduler, worker, metadata database и executor.</w:t>
       </w:r>
     </w:p>
     <w:p>
@@ -5083,7 +4786,23 @@
           <w:i w:val="0"/>
           <w:sz w:val="28"/>
         </w:rPr>
-        <w:t>Parquet выбран как формат хранения, потому что он является колоночным, поддерживает сжатие и широко читается аналитическими движками. Для будущего развития поверх Parquet можно добавить Iceberg, Delta Lake или Hudi, если появятся требования к ACID-операциям, schema evolution и time travel. На уровне текущего bronze-прототипа Parquet достаточен для хранения снимков и дальнейшего чтения.</w:t>
+        <w:t>DuckDB выбран как движок ELT для первого bronze-этапа, потому что он поддерживает чтение JSON, запись Parquet и работу с S3 через httpfs без отдельного кластера. Для массовой распределённой обработки в дальнейшем лучше использовать Spark. Для федеративных запросов по нескольким хранилищам уместен Trino. Для быстрых аналитических витрин — ClickHouse. Для текущего ingest одного API-снимка эти инструменты избыточны как обязательная часть первого слоя, но архитектура сохраняет возможность подключить их позже.</w:t>
+      </w:r>
+    </w:p>
+    <w:p>
+      <w:pPr>
+        <w:spacing w:line="360" w:lineRule="auto" w:after="0"/>
+        <w:ind w:firstLine="709"/>
+        <w:jc w:val="both"/>
+      </w:pPr>
+      <w:r>
+        <w:rPr>
+          <w:rFonts w:ascii="Times New Roman" w:hAnsi="Times New Roman" w:eastAsia="Times New Roman"/>
+          <w:b w:val="0"/>
+          <w:i w:val="0"/>
+          <w:sz w:val="28"/>
+        </w:rPr>
+        <w:t>Parquet выбран как формат хранения, потому что для аналитических данных лучше применять колоночные форматы с компрессией, а не CSV или произвольный JSON как основной формат чтения. JSON целесообразно сохранять как исходный контракт API, но для запросов и последующей обработки Parquet эффективнее по размеру и скорости чтения. Для будущего развития поверх Parquet можно добавить Iceberg, Delta Lake или Hudi, если появятся требования к ACID-операциям, schema evolution, upsert и time travel.</w:t>
       </w:r>
     </w:p>
     <w:p>

</xml_diff>